<commit_message>
fix(report): tag NSR caption numbers, rename NSR count header, uppercase cover month
</commit_message>
<xml_diff>
--- a/src/reports/monthly-template.docx
+++ b/src/reports/monthly-template.docx
@@ -34,7 +34,7 @@
           <w:sz w:val="52"/>
           <w:szCs w:val="52"/>
         </w:rPr>
-        <w:t>{monthLabel}</w:t>
+        <w:t>{monthUpper}</w:t>
       </w:r>
     </w:p>
     <w:p>
@@ -1691,7 +1691,7 @@
         <w:spacing w:before="60" w:after="60"/>
       </w:pPr>
       <w:r>
-        <w:t>6 new schemes launched in {monthLabel}, raising ₹1,740.00 Cr. Source: AMFI NSR data.</w:t>
+        <w:t xml:space="preserve">{universe.nsr.totalSchemes} new schemes launched in {monthLabel}, raising ₹{nsrMobilised} Cr. Source: AMFI NSR data.</w:t>
       </w:r>
     </w:p>
     <w:tbl>
@@ -1807,7 +1807,7 @@
                 <w:sz w:val="17"/>
                 <w:szCs w:val="17"/>
               </w:rPr>
-              <w:t>AMC</w:t>
+              <w:t>Count</w:t>
             </w:r>
           </w:p>
         </w:tc>

</xml_diff>

<commit_message>
Fix hardcoded month in report header
Template header1.xml had 'Jun 2026' as literal text, so every generated
report showed it regardless of month. Now renders {reportMonthShort},
which tracks the report month even when AMFI figures fall back a month.
</commit_message>
<xml_diff>
--- a/src/reports/monthly-template.docx
+++ b/src/reports/monthly-template.docx
@@ -9525,15 +9525,7 @@
               <w:sz w:val="17"/>
               <w:szCs w:val="17"/>
             </w:rPr>
-            <w:t>Jun</w:t>
-          </w:r>
-          <w:r>
-            <w:rPr>
-              <w:color w:val="7F8C8D"/>
-              <w:sz w:val="17"/>
-              <w:szCs w:val="17"/>
-            </w:rPr>
-            <w:t xml:space="preserve"> 2026</w:t>
+            <w:t xml:space="preserve">{reportMonthShort}</w:t>
           </w:r>
           <w:r>
             <w:rPr>

</xml_diff>